<commit_message>
v1 para primera entrega
</commit_message>
<xml_diff>
--- a/docTemplates/FacturaTemplate.docx
+++ b/docTemplates/FacturaTemplate.docx
@@ -6,115 +6,15 @@
       <w:r>
         <w:t>${</w:t>
       </w:r>
-      <w:proofErr w:type="spellStart"/>
       <w:r>
-        <w:t>Paciente.</w:t>
+        <w:t>Cita</w:t>
       </w:r>
       <w:r>
-        <w:t>nif</w:t>
-      </w:r>
-      <w:proofErr w:type="spellEnd"/>
-      <w:r>
-        <w:t>}</w:t>
-      </w:r>
-    </w:p>
-    <w:p>
-      <w:r>
-        <w:t>${</w:t>
-      </w:r>
-      <w:proofErr w:type="spellStart"/>
-      <w:r>
-        <w:t>Paciente.</w:t>
+        <w:t>.</w:t>
       </w:r>
       <w:r>
-        <w:t>nombre</w:t>
+        <w:t>nombre_completo</w:t>
       </w:r>
-      <w:proofErr w:type="spellEnd"/>
-      <w:r>
-        <w:t>}</w:t>
-      </w:r>
-    </w:p>
-    <w:p>
-      <w:r>
-        <w:t>${</w:t>
-      </w:r>
-      <w:proofErr w:type="spellStart"/>
-      <w:r>
-        <w:t>Paciente.</w:t>
-      </w:r>
-      <w:r>
-        <w:t>apellidos</w:t>
-      </w:r>
-      <w:proofErr w:type="spellEnd"/>
-      <w:r>
-        <w:t>}</w:t>
-      </w:r>
-    </w:p>
-    <w:p>
-      <w:r>
-        <w:t>${</w:t>
-      </w:r>
-      <w:proofErr w:type="spellStart"/>
-      <w:r>
-        <w:t>Paciente.</w:t>
-      </w:r>
-      <w:r>
-        <w:t>calle</w:t>
-      </w:r>
-      <w:proofErr w:type="spellEnd"/>
-      <w:r>
-        <w:t>}</w:t>
-      </w:r>
-    </w:p>
-    <w:p>
-      <w:r>
-        <w:t>${</w:t>
-      </w:r>
-      <w:proofErr w:type="spellStart"/>
-      <w:r>
-        <w:t>Paciente.</w:t>
-      </w:r>
-      <w:r>
-        <w:t>numero</w:t>
-      </w:r>
-      <w:proofErr w:type="spellEnd"/>
-      <w:r>
-        <w:t>}</w:t>
-      </w:r>
-    </w:p>
-    <w:p>
-      <w:r>
-        <w:t>${</w:t>
-      </w:r>
-      <w:proofErr w:type="spellStart"/>
-      <w:r>
-        <w:t>Paciente.</w:t>
-      </w:r>
-      <w:r>
-        <w:t>ciudad</w:t>
-      </w:r>
-      <w:proofErr w:type="spellEnd"/>
-      <w:r>
-        <w:t>}</w:t>
-      </w:r>
-    </w:p>
-    <w:p>
-      <w:pPr>
-        <w:rPr>
-          <w:u w:val="single"/>
-        </w:rPr>
-      </w:pPr>
-      <w:r>
-        <w:t>${</w:t>
-      </w:r>
-      <w:proofErr w:type="spellStart"/>
-      <w:r>
-        <w:t>Paciente.</w:t>
-      </w:r>
-      <w:r>
-        <w:t>provincia</w:t>
-      </w:r>
-      <w:proofErr w:type="spellEnd"/>
       <w:r>
         <w:t>}</w:t>
       </w:r>

</xml_diff>